<commit_message>
Fix template tags and data map
Co-authored-by: SertussLegal <265928946+SertussLegal@users.noreply.github.com>
</commit_message>
<xml_diff>
--- a/public/template_venta_hipoteca.docx
+++ b/public/template_venta_hipoteca.docx
@@ -5771,7 +5771,7 @@
           <w:szCs w:val="24"/>
           <w:rtl w:val="0"/>
         </w:rPr>
-        <w:t xml:space="preserve">{/tiene_hipoteca}</w:t>
+        <w:t xml:space="preserve"/>
       </w:r>
       <w:r>
         <w:rPr>
@@ -7575,7 +7575,7 @@
           <w:szCs w:val="24"/>
           <w:rtl w:val="0"/>
         </w:rPr>
-        <w:t xml:space="preserve">{# }</w:t>
+        <w:t xml:space="preserve"/>
       </w:r>
       <w:r>
         <w:rPr>

</xml_diff>